<commit_message>
Improve small-screen play, expand menu and add Cafe Star goal
</commit_message>
<xml_diff>
--- a/submission/Coffee-Track-Submission-DRAFT.docx
+++ b/submission/Coffee-Track-Submission-DRAFT.docx
@@ -71,7 +71,7 @@
     </w:p>
     <w:p>
       <w:r>
-        <w:t>The menu includes coffee, tea, croissants, sandwiches, cake and cookies. Orders contain different combinations and quantities. Difficulty increases as successful service produces larger orders and faster arrivals.</w:t>
+        <w:t>The menu includes coffee, tea, croissants, sandwiches, cake, cookies, soup and salad. Orders contain different combinations and quantities. Difficulty increases as successful service produces larger orders and faster arrivals.</w:t>
       </w:r>
     </w:p>
     <w:p>
@@ -227,7 +227,7 @@
     </w:tbl>
     <w:p>
       <w:r>
-        <w:t>Score cannot fall below zero. A local best score rewards replay. Each service displays feedback explaining the outcome.</w:t>
+        <w:t>Score cannot fall below zero. A local best score rewards replay. A visible 1,000-point goal awards the Café Star title without changing the scoring rules. Each service displays feedback explaining the outcome.</w:t>
       </w:r>
     </w:p>
     <w:p>

</xml_diff>